<commit_message>
Shorten snow blower script intro to ~120 words
Co-Authored-By: Claude Sonnet 5.5 <noreply@anthropic.com>
</commit_message>
<xml_diff>
--- a/scripts/6-best-snow-blowers-for-long-driveways-2026.docx
+++ b/scripts/6-best-snow-blowers-for-long-driveways-2026.docx
@@ -25,7 +25,7 @@
           <w:sz w:val="20"/>
           <w:szCs w:val="20"/>
         </w:rPr>
-        <w:t xml:space="preserve">Script total: 1957 words. Hook type 5 (Absurd Number). Villain: Ryobi 40V 2-stage (older 21" listing).</w:t>
+        <w:t xml:space="preserve">Script total: 1840 words. Hook type 5 (Absurd Number). Villain: Ryobi 40V 2-stage (older 21" listing).</w:t>
       </w:r>
     </w:p>
     <w:p>
@@ -276,7 +276,7 @@
             </w:tcMar>
           </w:tcPr>
           <w:p>
-            <w:hyperlink w:history="1" r:id="rId15achrlcsizufyr5nk09v">
+            <w:hyperlink w:history="1" r:id="rIdhw6t4yzqkgee3o6wckzx0">
               <w:r>
                 <w:rPr>
                   <w:rStyle w:val="Hyperlink"/>
@@ -385,7 +385,7 @@
             </w:tcMar>
           </w:tcPr>
           <w:p>
-            <w:hyperlink w:history="1" r:id="rIdwzjatyt6j671txeyb_ai9">
+            <w:hyperlink w:history="1" r:id="rIddk3dl1uefenxau1wlkrzd">
               <w:r>
                 <w:rPr>
                   <w:rStyle w:val="Hyperlink"/>
@@ -494,7 +494,7 @@
             </w:tcMar>
           </w:tcPr>
           <w:p>
-            <w:hyperlink w:history="1" r:id="rIdk8tg9osj4rsad08689tw2">
+            <w:hyperlink w:history="1" r:id="rIdkgmzatfqyvtn1pnve_1_z">
               <w:r>
                 <w:rPr>
                   <w:rStyle w:val="Hyperlink"/>
@@ -603,7 +603,7 @@
             </w:tcMar>
           </w:tcPr>
           <w:p>
-            <w:hyperlink w:history="1" r:id="rIdr68edxqz8zofzo9xds66o">
+            <w:hyperlink w:history="1" r:id="rIdfki0bbj5-dzng0c_qkmxl">
               <w:r>
                 <w:rPr>
                   <w:rStyle w:val="Hyperlink"/>
@@ -712,7 +712,7 @@
             </w:tcMar>
           </w:tcPr>
           <w:p>
-            <w:hyperlink w:history="1" r:id="rIdrkmugaahi60ef8896gvok">
+            <w:hyperlink w:history="1" r:id="rIdvb2yxbtf564t9lgqdlsu9">
               <w:r>
                 <w:rPr>
                   <w:rStyle w:val="Hyperlink"/>
@@ -821,7 +821,7 @@
             </w:tcMar>
           </w:tcPr>
           <w:p>
-            <w:hyperlink w:history="1" r:id="rId1b31xgxx-krchlu0r2qrt">
+            <w:hyperlink w:history="1" r:id="rIdu3hzzoyqrhjddv09jpw_7">
               <w:r>
                 <w:rPr>
                   <w:rStyle w:val="Hyperlink"/>
@@ -930,7 +930,7 @@
             </w:tcMar>
           </w:tcPr>
           <w:p>
-            <w:hyperlink w:history="1" r:id="rIdg5myg7wvo4f2icsz2wbja">
+            <w:hyperlink w:history="1" r:id="rIdv1k7bo4wnz6pbzw7-kad9">
               <w:r>
                 <w:rPr>
                   <w:rStyle w:val="Hyperlink"/>
@@ -1094,7 +1094,7 @@
             </w:tcMar>
           </w:tcPr>
           <w:p>
-            <w:hyperlink w:history="1" r:id="rIdaqpgl2hidoij6qrslhxm2">
+            <w:hyperlink w:history="1" r:id="rId6-x3gbt27skdwwxcevg6i">
               <w:r>
                 <w:rPr>
                   <w:rStyle w:val="Hyperlink"/>
@@ -1151,7 +1151,7 @@
             </w:tcMar>
           </w:tcPr>
           <w:p>
-            <w:hyperlink w:history="1" r:id="rIdsxzmvhhjoyk5tjfuvrx4l">
+            <w:hyperlink w:history="1" r:id="rIdvrjo4u3xozoxz-7etfhn6">
               <w:r>
                 <w:rPr>
                   <w:rStyle w:val="Hyperlink"/>
@@ -1208,7 +1208,7 @@
             </w:tcMar>
           </w:tcPr>
           <w:p>
-            <w:hyperlink w:history="1" r:id="rIdqef6hcsdncuwig6x3xq3k">
+            <w:hyperlink w:history="1" r:id="rIdfujixwsslryzcgejhgydn">
               <w:r>
                 <w:rPr>
                   <w:rStyle w:val="Hyperlink"/>
@@ -1265,7 +1265,7 @@
             </w:tcMar>
           </w:tcPr>
           <w:p>
-            <w:hyperlink w:history="1" r:id="rIdhd5kzweyzgoql3wopspdq">
+            <w:hyperlink w:history="1" r:id="rIdw0mm7bty0vnnthngipmv-">
               <w:r>
                 <w:rPr>
                   <w:rStyle w:val="Hyperlink"/>
@@ -2766,55 +2766,43 @@
           <w:b/>
           <w:bCs/>
         </w:rPr>
-        <w:t xml:space="preserve">HOOK — 234 words</w:t>
-      </w:r>
-    </w:p>
-    <w:p>
-      <w:pPr>
-        <w:spacing w:after="120"/>
-      </w:pPr>
-      <w:r>
-        <w:rPr>
-          <w:sz w:val="22"/>
-          <w:szCs w:val="22"/>
-        </w:rPr>
-        <w:t xml:space="preserve">One listing says its snow blower moves twenty-five hundred pounds of snow a minute and weighs one hundred eighty-seven pounds. Another says nineteen hundred pounds a minute, and it weighs three hundred fifty-eight. If bigger numbers meant a cleaner driveway, the first one should win easily, and nobody who has used both would tell you that.</w:t>
-      </w:r>
-    </w:p>
-    <w:p>
-      <w:pPr>
-        <w:spacing w:after="120"/>
-      </w:pPr>
-      <w:r>
-        <w:rPr>
-          <w:sz w:val="22"/>
-          <w:szCs w:val="22"/>
-        </w:rPr>
-        <w:t xml:space="preserve">Here is what makes this category hard for a long driveway. Every box shouts a number: cubic centimeters, volts, pounds a minute, cars per charge. Almost none of those numbers come from someone who stood in a driveway and measured. Real testing is thin, so a buyer ends up comparing claims that were never checked.</w:t>
-      </w:r>
-    </w:p>
-    <w:p>
-      <w:pPr>
-        <w:spacing w:after="120"/>
-      </w:pPr>
-      <w:r>
-        <w:rPr>
-          <w:sz w:val="22"/>
-          <w:szCs w:val="22"/>
-        </w:rPr>
-        <w:t xml:space="preserve">So I went to the people who did the work. Bob Vila's team ran over thirty-five models through ten inches of heavy wet snow on two seventy-five foot driveways. Consumer Reports lab results, as reported by a TV station, cover speed, throw distance and plow piles. Pro Tool Reviews ranked battery models on their specs. Six machines made this list, and each one is judged on three questions in the same order: what the maker claims, what a tester found, and what it can't do. I'll tell you which one is number one and why.</w:t>
-      </w:r>
-    </w:p>
-    <w:p>
-      <w:pPr>
-        <w:spacing w:after="120"/>
-      </w:pPr>
-      <w:r>
-        <w:rPr>
-          <w:sz w:val="22"/>
-          <w:szCs w:val="22"/>
-        </w:rPr>
-        <w:t xml:space="preserve">Before that, one popular battery family where two outlets disagree, and after the list, three free habits for the storm. All the product links are in the description.</w:t>
+        <w:t xml:space="preserve">HOOK — 117 words</w:t>
+      </w:r>
+    </w:p>
+    <w:p>
+      <w:pPr>
+        <w:spacing w:after="120"/>
+      </w:pPr>
+      <w:r>
+        <w:rPr>
+          <w:sz w:val="22"/>
+          <w:szCs w:val="22"/>
+        </w:rPr>
+        <w:t xml:space="preserve">One listing says its snow blower moves twenty-five hundred pounds of snow a minute and weighs one hundred eighty-seven pounds. Another claims nineteen hundred and weighs three hundred fifty-eight. If bigger numbers meant a cleaner driveway, the first would win, and nobody who has used both would say so.</w:t>
+      </w:r>
+    </w:p>
+    <w:p>
+      <w:pPr>
+        <w:spacing w:after="120"/>
+      </w:pPr>
+      <w:r>
+        <w:rPr>
+          <w:sz w:val="22"/>
+          <w:szCs w:val="22"/>
+        </w:rPr>
+        <w:t xml:space="preserve">So I went to people who did the work. Bob Vila's team ran over thirty-five models through ten inches of heavy wet snow. Consumer Reports lab results, as a TV station reported them, cover speed and throw. Six machines made this list, and I'll tell you which is number one and why.</w:t>
+      </w:r>
+    </w:p>
+    <w:p>
+      <w:pPr>
+        <w:spacing w:after="120"/>
+      </w:pPr>
+      <w:r>
+        <w:rPr>
+          <w:sz w:val="22"/>
+          <w:szCs w:val="22"/>
+        </w:rPr>
+        <w:t xml:space="preserve">Before that, one battery family where two outlets disagree. All the links are in the description.</w:t>
       </w:r>
     </w:p>
     <w:p>

</xml_diff>